<commit_message>
Bridge draft: record Paper 8 sec 4.2 as corpus-internal precursor of sec 5
Co-Authored-By: Claude Fable 5 <noreply@anthropic.com>
</commit_message>
<xml_diff>
--- a/joint_paper/Bitangent_Bridge_DRAFT.docx
+++ b/joint_paper/Bitangent_Bridge_DRAFT.docx
@@ -1941,7 +1941,89 @@
         <w:t xml:space="preserve"> </w:t>
       </w:r>
       <w:r>
-        <w:t xml:space="preserve">Sp₆(2) ≅ W(E₇)/± — is classical. The contribution of this note is (a) the</w:t>
+        <w:t xml:space="preserve">Sp₆(2) ≅ W(E₇)/± — is classical. A precursor</w:t>
+      </w:r>
+      <w:r>
+        <w:t xml:space="preserve"> </w:t>
+      </w:r>
+      <w:r>
+        <w:rPr>
+          <w:b/>
+          <w:bCs/>
+        </w:rPr>
+        <w:t xml:space="preserve">within the Stenberg corpus</w:t>
+      </w:r>
+      <w:r>
+        <w:t xml:space="preserve"> </w:t>
+      </w:r>
+      <w:r>
+        <w:t xml:space="preserve">deserves record: Paper 8 §4.2 (2026, pre-audit) already stated the 36+28</w:t>
+      </w:r>
+      <w:r>
+        <w:t xml:space="preserve"> </w:t>
+      </w:r>
+      <w:r>
+        <w:t xml:space="preserve">theta-characteristic split on the Klein quartic, the transitivity of</w:t>
+      </w:r>
+      <w:r>
+        <w:t xml:space="preserve"> </w:t>
+      </w:r>
+      <w:r>
+        <w:t xml:space="preserve">PSL(2,7) on the 28 odd characteristics with S₃ stabilizer, and that the</w:t>
+      </w:r>
+      <w:r>
+        <w:t xml:space="preserve"> </w:t>
+      </w:r>
+      <w:r>
+        <w:t xml:space="preserve">even characteristics split into</w:t>
+      </w:r>
+      <w:r>
+        <w:t xml:space="preserve"> </w:t>
+      </w:r>
+      <w:r>
+        <w:t xml:space="preserve">“multiple orbits”</w:t>
+      </w:r>
+      <w:r>
+        <w:t xml:space="preserve"> </w:t>
+      </w:r>
+      <w:r>
+        <w:t xml:space="preserve">— the germ of §5,</w:t>
+      </w:r>
+      <w:r>
+        <w:t xml:space="preserve"> </w:t>
+      </w:r>
+      <w:r>
+        <w:t xml:space="preserve">perceived before the audit era. What is new here relative to that</w:t>
+      </w:r>
+      <w:r>
+        <w:t xml:space="preserve"> </w:t>
+      </w:r>
+      <w:r>
+        <w:t xml:space="preserve">precursor: the stabilizer-of-one-bitangent identified as W(E₆) (replacing</w:t>
+      </w:r>
+      <w:r>
+        <w:t xml:space="preserve"> </w:t>
+      </w:r>
+      <w:r>
+        <w:t xml:space="preserve">the cardinality reading 28 = dim D₄), the exact even-orbit structure</w:t>
+      </w:r>
+      <w:r>
+        <w:t xml:space="preserve"> </w:t>
+      </w:r>
+      <w:r>
+        <w:t xml:space="preserve">[1,7,7,21], the 2:1 map from class 3A, the S₃ identified with both</w:t>
+      </w:r>
+      <w:r>
+        <w:t xml:space="preserve"> </w:t>
+      </w:r>
+      <w:r>
+        <w:t xml:space="preserve">programs’ canonical S₃, and the whole assembled as the meeting of the two</w:t>
+      </w:r>
+      <w:r>
+        <w:t xml:space="preserve"> </w:t>
+      </w:r>
+      <w:r>
+        <w:t xml:space="preserve">frameworks. The contribution of this note is (a) the</w:t>
       </w:r>
       <w:r>
         <w:t xml:space="preserve"> </w:t>

</xml_diff>